<commit_message>
Corrige Aula 6 e adiciona Apostila e Slides da Aula 7
Aula 6: capa no padrão, logo decorativo restaurado em todos os slides,
slide final com fundo e imagens, agenda alinhada ao roteiro e
formatação de títulos/tabelas da apostila.
Aula 7: Diagrama de Atividades, com três atividades práticas
(TechBurger, FitLife e revisão geral PetFeliz).
</commit_message>
<xml_diff>
--- a/Aula 06 - 25-09-2026/Aula 6 - Apostila do Aluno.docx
+++ b/Aula 06 - 25-09-2026/Aula 6 - Apostila do Aluno.docx
@@ -4,21 +4,36 @@
   <w:body>
     <w:p>
       <w:r>
+        <w:rPr>
+          <w:b/>
+          <w:color w:val="1F497D"/>
+          <w:sz w:val="40"/>
+        </w:rPr>
         <w:t>APOSTILA DO ALUNO — AULA 6</w:t>
       </w:r>
     </w:p>
     <w:p>
       <w:r>
+        <w:rPr>
+          <w:b/>
+          <w:sz w:val="28"/>
+        </w:rPr>
         <w:t>UML — Diagrama de Classes II: Multiplicidade/Cardinalidade</w:t>
       </w:r>
     </w:p>
     <w:p>
       <w:r>
+        <w:rPr>
+          <w:sz w:val="21"/>
+        </w:rPr>
         <w:t>Curso: Técnico em Desenvolvimento de Sistemas  |  Turma: 103513  |  Disciplina: Modelagem de Sistemas (82h + 04h planejamento)</w:t>
       </w:r>
     </w:p>
     <w:p>
       <w:r>
+        <w:rPr>
+          <w:sz w:val="21"/>
+        </w:rPr>
         <w:t>Data: 25/09/2026 (sexta-feira)  |  Horário: 07:30 às 11:30 (4h)</w:t>
       </w:r>
     </w:p>
@@ -127,12 +142,23 @@
         <w:tc>
           <w:tcPr>
             <w:tcW w:type="dxa" w:w="3324"/>
+            <w:shd w:val="clear" w:color="auto" w:fill="1F497D"/>
           </w:tcPr>
           <w:p>
-            <w:r/>
+            <w:pPr>
+              <w:spacing w:after="40"/>
+            </w:pPr>
             <w:r>
               <w:rPr>
                 <w:b/>
+                <w:color w:val="FFFFFF"/>
+                <w:sz w:val="20"/>
+              </w:rPr>
+            </w:r>
+            <w:r>
+              <w:rPr>
+                <w:b/>
+                <w:color w:val="FFFFFF"/>
                 <w:sz w:val="20"/>
               </w:rPr>
               <w:t>Relacionamento</w:t>
@@ -142,12 +168,23 @@
         <w:tc>
           <w:tcPr>
             <w:tcW w:type="dxa" w:w="3324"/>
+            <w:shd w:val="clear" w:color="auto" w:fill="1F497D"/>
           </w:tcPr>
           <w:p>
-            <w:r/>
+            <w:pPr>
+              <w:spacing w:after="40"/>
+            </w:pPr>
             <w:r>
               <w:rPr>
                 <w:b/>
+                <w:color w:val="FFFFFF"/>
+                <w:sz w:val="20"/>
+              </w:rPr>
+            </w:r>
+            <w:r>
+              <w:rPr>
+                <w:b/>
+                <w:color w:val="FFFFFF"/>
                 <w:sz w:val="20"/>
               </w:rPr>
               <w:t>Significado</w:t>
@@ -157,12 +194,23 @@
         <w:tc>
           <w:tcPr>
             <w:tcW w:type="dxa" w:w="3324"/>
+            <w:shd w:val="clear" w:color="auto" w:fill="1F497D"/>
           </w:tcPr>
           <w:p>
-            <w:r/>
+            <w:pPr>
+              <w:spacing w:after="40"/>
+            </w:pPr>
             <w:r>
               <w:rPr>
                 <w:b/>
+                <w:color w:val="FFFFFF"/>
+                <w:sz w:val="20"/>
+              </w:rPr>
+            </w:r>
+            <w:r>
+              <w:rPr>
+                <w:b/>
+                <w:color w:val="FFFFFF"/>
                 <w:sz w:val="20"/>
               </w:rPr>
               <w:t>Notação</w:t>
@@ -441,12 +489,23 @@
         <w:tc>
           <w:tcPr>
             <w:tcW w:type="dxa" w:w="2493"/>
+            <w:shd w:val="clear" w:color="auto" w:fill="1F497D"/>
           </w:tcPr>
           <w:p>
-            <w:r/>
+            <w:pPr>
+              <w:spacing w:after="40"/>
+            </w:pPr>
             <w:r>
               <w:rPr>
                 <w:b/>
+                <w:color w:val="FFFFFF"/>
+                <w:sz w:val="20"/>
+              </w:rPr>
+            </w:r>
+            <w:r>
+              <w:rPr>
+                <w:b/>
+                <w:color w:val="FFFFFF"/>
                 <w:sz w:val="20"/>
               </w:rPr>
               <w:t>Notação</w:t>
@@ -456,12 +515,23 @@
         <w:tc>
           <w:tcPr>
             <w:tcW w:type="dxa" w:w="2493"/>
+            <w:shd w:val="clear" w:color="auto" w:fill="1F497D"/>
           </w:tcPr>
           <w:p>
-            <w:r/>
+            <w:pPr>
+              <w:spacing w:after="40"/>
+            </w:pPr>
             <w:r>
               <w:rPr>
                 <w:b/>
+                <w:color w:val="FFFFFF"/>
+                <w:sz w:val="20"/>
+              </w:rPr>
+            </w:r>
+            <w:r>
+              <w:rPr>
+                <w:b/>
+                <w:color w:val="FFFFFF"/>
                 <w:sz w:val="20"/>
               </w:rPr>
               <w:t>Significado</w:t>
@@ -471,12 +541,23 @@
         <w:tc>
           <w:tcPr>
             <w:tcW w:type="dxa" w:w="2493"/>
+            <w:shd w:val="clear" w:color="auto" w:fill="1F497D"/>
           </w:tcPr>
           <w:p>
-            <w:r/>
+            <w:pPr>
+              <w:spacing w:after="40"/>
+            </w:pPr>
             <w:r>
               <w:rPr>
                 <w:b/>
+                <w:color w:val="FFFFFF"/>
+                <w:sz w:val="20"/>
+              </w:rPr>
+            </w:r>
+            <w:r>
+              <w:rPr>
+                <w:b/>
+                <w:color w:val="FFFFFF"/>
                 <w:sz w:val="20"/>
               </w:rPr>
               <w:t>Mínimo</w:t>
@@ -486,12 +567,23 @@
         <w:tc>
           <w:tcPr>
             <w:tcW w:type="dxa" w:w="2493"/>
+            <w:shd w:val="clear" w:color="auto" w:fill="1F497D"/>
           </w:tcPr>
           <w:p>
-            <w:r/>
+            <w:pPr>
+              <w:spacing w:after="40"/>
+            </w:pPr>
             <w:r>
               <w:rPr>
                 <w:b/>
+                <w:color w:val="FFFFFF"/>
+                <w:sz w:val="20"/>
+              </w:rPr>
+            </w:r>
+            <w:r>
+              <w:rPr>
+                <w:b/>
+                <w:color w:val="FFFFFF"/>
                 <w:sz w:val="20"/>
               </w:rPr>
               <w:t>Máximo</w:t>
@@ -812,12 +904,23 @@
         <w:tc>
           <w:tcPr>
             <w:tcW w:type="dxa" w:w="4986"/>
+            <w:shd w:val="clear" w:color="auto" w:fill="1F497D"/>
           </w:tcPr>
           <w:p>
-            <w:r/>
+            <w:pPr>
+              <w:spacing w:after="40"/>
+            </w:pPr>
             <w:r>
               <w:rPr>
                 <w:b/>
+                <w:color w:val="FFFFFF"/>
+                <w:sz w:val="20"/>
+              </w:rPr>
+            </w:r>
+            <w:r>
+              <w:rPr>
+                <w:b/>
+                <w:color w:val="FFFFFF"/>
                 <w:sz w:val="20"/>
               </w:rPr>
               <w:t>Têm cardinalidade</w:t>
@@ -827,12 +930,23 @@
         <w:tc>
           <w:tcPr>
             <w:tcW w:type="dxa" w:w="4986"/>
+            <w:shd w:val="clear" w:color="auto" w:fill="1F497D"/>
           </w:tcPr>
           <w:p>
-            <w:r/>
+            <w:pPr>
+              <w:spacing w:after="40"/>
+            </w:pPr>
             <w:r>
               <w:rPr>
                 <w:b/>
+                <w:color w:val="FFFFFF"/>
+                <w:sz w:val="20"/>
+              </w:rPr>
+            </w:r>
+            <w:r>
+              <w:rPr>
+                <w:b/>
+                <w:color w:val="FFFFFF"/>
                 <w:sz w:val="20"/>
               </w:rPr>
               <w:t>Não tem cardinalidade</w:t>
@@ -1099,12 +1213,23 @@
         <w:tc>
           <w:tcPr>
             <w:tcW w:type="dxa" w:w="1994"/>
+            <w:shd w:val="clear" w:color="auto" w:fill="1F497D"/>
           </w:tcPr>
           <w:p>
-            <w:r/>
+            <w:pPr>
+              <w:spacing w:after="40"/>
+            </w:pPr>
             <w:r>
               <w:rPr>
                 <w:b/>
+                <w:color w:val="FFFFFF"/>
+                <w:sz w:val="20"/>
+              </w:rPr>
+            </w:r>
+            <w:r>
+              <w:rPr>
+                <w:b/>
+                <w:color w:val="FFFFFF"/>
                 <w:sz w:val="20"/>
               </w:rPr>
               <w:t>Classe A</w:t>
@@ -1114,12 +1239,23 @@
         <w:tc>
           <w:tcPr>
             <w:tcW w:type="dxa" w:w="1994"/>
+            <w:shd w:val="clear" w:color="auto" w:fill="1F497D"/>
           </w:tcPr>
           <w:p>
-            <w:r/>
+            <w:pPr>
+              <w:spacing w:after="40"/>
+            </w:pPr>
             <w:r>
               <w:rPr>
                 <w:b/>
+                <w:color w:val="FFFFFF"/>
+                <w:sz w:val="20"/>
+              </w:rPr>
+            </w:r>
+            <w:r>
+              <w:rPr>
+                <w:b/>
+                <w:color w:val="FFFFFF"/>
                 <w:sz w:val="20"/>
               </w:rPr>
               <w:t>Card. A</w:t>
@@ -1129,12 +1265,23 @@
         <w:tc>
           <w:tcPr>
             <w:tcW w:type="dxa" w:w="1994"/>
+            <w:shd w:val="clear" w:color="auto" w:fill="1F497D"/>
           </w:tcPr>
           <w:p>
-            <w:r/>
+            <w:pPr>
+              <w:spacing w:after="40"/>
+            </w:pPr>
             <w:r>
               <w:rPr>
                 <w:b/>
+                <w:color w:val="FFFFFF"/>
+                <w:sz w:val="20"/>
+              </w:rPr>
+            </w:r>
+            <w:r>
+              <w:rPr>
+                <w:b/>
+                <w:color w:val="FFFFFF"/>
                 <w:sz w:val="20"/>
               </w:rPr>
               <w:t>Relacionamento</w:t>
@@ -1144,12 +1291,23 @@
         <w:tc>
           <w:tcPr>
             <w:tcW w:type="dxa" w:w="1994"/>
+            <w:shd w:val="clear" w:color="auto" w:fill="1F497D"/>
           </w:tcPr>
           <w:p>
-            <w:r/>
+            <w:pPr>
+              <w:spacing w:after="40"/>
+            </w:pPr>
             <w:r>
               <w:rPr>
                 <w:b/>
+                <w:color w:val="FFFFFF"/>
+                <w:sz w:val="20"/>
+              </w:rPr>
+            </w:r>
+            <w:r>
+              <w:rPr>
+                <w:b/>
+                <w:color w:val="FFFFFF"/>
                 <w:sz w:val="20"/>
               </w:rPr>
               <w:t>Card. B</w:t>
@@ -1159,12 +1317,23 @@
         <w:tc>
           <w:tcPr>
             <w:tcW w:type="dxa" w:w="1994"/>
+            <w:shd w:val="clear" w:color="auto" w:fill="1F497D"/>
           </w:tcPr>
           <w:p>
-            <w:r/>
+            <w:pPr>
+              <w:spacing w:after="40"/>
+            </w:pPr>
             <w:r>
               <w:rPr>
                 <w:b/>
+                <w:color w:val="FFFFFF"/>
+                <w:sz w:val="20"/>
+              </w:rPr>
+            </w:r>
+            <w:r>
+              <w:rPr>
+                <w:b/>
+                <w:color w:val="FFFFFF"/>
                 <w:sz w:val="20"/>
               </w:rPr>
               <w:t>Classe B</w:t>
@@ -1735,12 +1904,23 @@
         <w:tc>
           <w:tcPr>
             <w:tcW w:type="dxa" w:w="1994"/>
+            <w:shd w:val="clear" w:color="auto" w:fill="1F497D"/>
           </w:tcPr>
           <w:p>
-            <w:r/>
+            <w:pPr>
+              <w:spacing w:after="40"/>
+            </w:pPr>
             <w:r>
               <w:rPr>
                 <w:b/>
+                <w:color w:val="FFFFFF"/>
+                <w:sz w:val="20"/>
+              </w:rPr>
+            </w:r>
+            <w:r>
+              <w:rPr>
+                <w:b/>
+                <w:color w:val="FFFFFF"/>
                 <w:sz w:val="20"/>
               </w:rPr>
               <w:t>Classe A</w:t>
@@ -1750,12 +1930,23 @@
         <w:tc>
           <w:tcPr>
             <w:tcW w:type="dxa" w:w="1994"/>
+            <w:shd w:val="clear" w:color="auto" w:fill="1F497D"/>
           </w:tcPr>
           <w:p>
-            <w:r/>
+            <w:pPr>
+              <w:spacing w:after="40"/>
+            </w:pPr>
             <w:r>
               <w:rPr>
                 <w:b/>
+                <w:color w:val="FFFFFF"/>
+                <w:sz w:val="20"/>
+              </w:rPr>
+            </w:r>
+            <w:r>
+              <w:rPr>
+                <w:b/>
+                <w:color w:val="FFFFFF"/>
                 <w:sz w:val="20"/>
               </w:rPr>
               <w:t>Card. A</w:t>
@@ -1765,12 +1956,23 @@
         <w:tc>
           <w:tcPr>
             <w:tcW w:type="dxa" w:w="1994"/>
+            <w:shd w:val="clear" w:color="auto" w:fill="1F497D"/>
           </w:tcPr>
           <w:p>
-            <w:r/>
+            <w:pPr>
+              <w:spacing w:after="40"/>
+            </w:pPr>
             <w:r>
               <w:rPr>
                 <w:b/>
+                <w:color w:val="FFFFFF"/>
+                <w:sz w:val="20"/>
+              </w:rPr>
+            </w:r>
+            <w:r>
+              <w:rPr>
+                <w:b/>
+                <w:color w:val="FFFFFF"/>
                 <w:sz w:val="20"/>
               </w:rPr>
               <w:t>Relacionamento</w:t>
@@ -1780,12 +1982,23 @@
         <w:tc>
           <w:tcPr>
             <w:tcW w:type="dxa" w:w="1994"/>
+            <w:shd w:val="clear" w:color="auto" w:fill="1F497D"/>
           </w:tcPr>
           <w:p>
-            <w:r/>
+            <w:pPr>
+              <w:spacing w:after="40"/>
+            </w:pPr>
             <w:r>
               <w:rPr>
                 <w:b/>
+                <w:color w:val="FFFFFF"/>
+                <w:sz w:val="20"/>
+              </w:rPr>
+            </w:r>
+            <w:r>
+              <w:rPr>
+                <w:b/>
+                <w:color w:val="FFFFFF"/>
                 <w:sz w:val="20"/>
               </w:rPr>
               <w:t>Card. B</w:t>
@@ -1795,12 +2008,23 @@
         <w:tc>
           <w:tcPr>
             <w:tcW w:type="dxa" w:w="1994"/>
+            <w:shd w:val="clear" w:color="auto" w:fill="1F497D"/>
           </w:tcPr>
           <w:p>
-            <w:r/>
+            <w:pPr>
+              <w:spacing w:after="40"/>
+            </w:pPr>
             <w:r>
               <w:rPr>
                 <w:b/>
+                <w:color w:val="FFFFFF"/>
+                <w:sz w:val="20"/>
+              </w:rPr>
+            </w:r>
+            <w:r>
+              <w:rPr>
+                <w:b/>
+                <w:color w:val="FFFFFF"/>
                 <w:sz w:val="20"/>
               </w:rPr>
               <w:t>Classe B</w:t>
@@ -2420,12 +2644,23 @@
         <w:tc>
           <w:tcPr>
             <w:tcW w:type="dxa" w:w="1994"/>
+            <w:shd w:val="clear" w:color="auto" w:fill="1F497D"/>
           </w:tcPr>
           <w:p>
-            <w:r/>
+            <w:pPr>
+              <w:spacing w:after="40"/>
+            </w:pPr>
             <w:r>
               <w:rPr>
                 <w:b/>
+                <w:color w:val="FFFFFF"/>
+                <w:sz w:val="20"/>
+              </w:rPr>
+            </w:r>
+            <w:r>
+              <w:rPr>
+                <w:b/>
+                <w:color w:val="FFFFFF"/>
                 <w:sz w:val="20"/>
               </w:rPr>
               <w:t>Classe A</w:t>
@@ -2435,12 +2670,23 @@
         <w:tc>
           <w:tcPr>
             <w:tcW w:type="dxa" w:w="1994"/>
+            <w:shd w:val="clear" w:color="auto" w:fill="1F497D"/>
           </w:tcPr>
           <w:p>
-            <w:r/>
+            <w:pPr>
+              <w:spacing w:after="40"/>
+            </w:pPr>
             <w:r>
               <w:rPr>
                 <w:b/>
+                <w:color w:val="FFFFFF"/>
+                <w:sz w:val="20"/>
+              </w:rPr>
+            </w:r>
+            <w:r>
+              <w:rPr>
+                <w:b/>
+                <w:color w:val="FFFFFF"/>
                 <w:sz w:val="20"/>
               </w:rPr>
               <w:t>Card. A</w:t>
@@ -2450,12 +2696,23 @@
         <w:tc>
           <w:tcPr>
             <w:tcW w:type="dxa" w:w="1994"/>
+            <w:shd w:val="clear" w:color="auto" w:fill="1F497D"/>
           </w:tcPr>
           <w:p>
-            <w:r/>
+            <w:pPr>
+              <w:spacing w:after="40"/>
+            </w:pPr>
             <w:r>
               <w:rPr>
                 <w:b/>
+                <w:color w:val="FFFFFF"/>
+                <w:sz w:val="20"/>
+              </w:rPr>
+            </w:r>
+            <w:r>
+              <w:rPr>
+                <w:b/>
+                <w:color w:val="FFFFFF"/>
                 <w:sz w:val="20"/>
               </w:rPr>
               <w:t>Relacionamento</w:t>
@@ -2465,12 +2722,23 @@
         <w:tc>
           <w:tcPr>
             <w:tcW w:type="dxa" w:w="1994"/>
+            <w:shd w:val="clear" w:color="auto" w:fill="1F497D"/>
           </w:tcPr>
           <w:p>
-            <w:r/>
+            <w:pPr>
+              <w:spacing w:after="40"/>
+            </w:pPr>
             <w:r>
               <w:rPr>
                 <w:b/>
+                <w:color w:val="FFFFFF"/>
+                <w:sz w:val="20"/>
+              </w:rPr>
+            </w:r>
+            <w:r>
+              <w:rPr>
+                <w:b/>
+                <w:color w:val="FFFFFF"/>
                 <w:sz w:val="20"/>
               </w:rPr>
               <w:t>Card. B</w:t>
@@ -2480,12 +2748,23 @@
         <w:tc>
           <w:tcPr>
             <w:tcW w:type="dxa" w:w="1994"/>
+            <w:shd w:val="clear" w:color="auto" w:fill="1F497D"/>
           </w:tcPr>
           <w:p>
-            <w:r/>
+            <w:pPr>
+              <w:spacing w:after="40"/>
+            </w:pPr>
             <w:r>
               <w:rPr>
                 <w:b/>
+                <w:color w:val="FFFFFF"/>
+                <w:sz w:val="20"/>
+              </w:rPr>
+            </w:r>
+            <w:r>
+              <w:rPr>
+                <w:b/>
+                <w:color w:val="FFFFFF"/>
                 <w:sz w:val="20"/>
               </w:rPr>
               <w:t>Classe B</w:t>
@@ -3035,12 +3314,23 @@
         <w:tc>
           <w:tcPr>
             <w:tcW w:type="dxa" w:w="1994"/>
+            <w:shd w:val="clear" w:color="auto" w:fill="1F497D"/>
           </w:tcPr>
           <w:p>
-            <w:r/>
+            <w:pPr>
+              <w:spacing w:after="40"/>
+            </w:pPr>
             <w:r>
               <w:rPr>
                 <w:b/>
+                <w:color w:val="FFFFFF"/>
+                <w:sz w:val="20"/>
+              </w:rPr>
+            </w:r>
+            <w:r>
+              <w:rPr>
+                <w:b/>
+                <w:color w:val="FFFFFF"/>
                 <w:sz w:val="20"/>
               </w:rPr>
               <w:t>Classe A</w:t>
@@ -3050,12 +3340,23 @@
         <w:tc>
           <w:tcPr>
             <w:tcW w:type="dxa" w:w="1994"/>
+            <w:shd w:val="clear" w:color="auto" w:fill="1F497D"/>
           </w:tcPr>
           <w:p>
-            <w:r/>
+            <w:pPr>
+              <w:spacing w:after="40"/>
+            </w:pPr>
             <w:r>
               <w:rPr>
                 <w:b/>
+                <w:color w:val="FFFFFF"/>
+                <w:sz w:val="20"/>
+              </w:rPr>
+            </w:r>
+            <w:r>
+              <w:rPr>
+                <w:b/>
+                <w:color w:val="FFFFFF"/>
                 <w:sz w:val="20"/>
               </w:rPr>
               <w:t>Card. A</w:t>
@@ -3065,12 +3366,23 @@
         <w:tc>
           <w:tcPr>
             <w:tcW w:type="dxa" w:w="1994"/>
+            <w:shd w:val="clear" w:color="auto" w:fill="1F497D"/>
           </w:tcPr>
           <w:p>
-            <w:r/>
+            <w:pPr>
+              <w:spacing w:after="40"/>
+            </w:pPr>
             <w:r>
               <w:rPr>
                 <w:b/>
+                <w:color w:val="FFFFFF"/>
+                <w:sz w:val="20"/>
+              </w:rPr>
+            </w:r>
+            <w:r>
+              <w:rPr>
+                <w:b/>
+                <w:color w:val="FFFFFF"/>
                 <w:sz w:val="20"/>
               </w:rPr>
               <w:t>Relacionamento</w:t>
@@ -3080,12 +3392,23 @@
         <w:tc>
           <w:tcPr>
             <w:tcW w:type="dxa" w:w="1994"/>
+            <w:shd w:val="clear" w:color="auto" w:fill="1F497D"/>
           </w:tcPr>
           <w:p>
-            <w:r/>
+            <w:pPr>
+              <w:spacing w:after="40"/>
+            </w:pPr>
             <w:r>
               <w:rPr>
                 <w:b/>
+                <w:color w:val="FFFFFF"/>
+                <w:sz w:val="20"/>
+              </w:rPr>
+            </w:r>
+            <w:r>
+              <w:rPr>
+                <w:b/>
+                <w:color w:val="FFFFFF"/>
                 <w:sz w:val="20"/>
               </w:rPr>
               <w:t>Card. B</w:t>
@@ -3095,12 +3418,23 @@
         <w:tc>
           <w:tcPr>
             <w:tcW w:type="dxa" w:w="1994"/>
+            <w:shd w:val="clear" w:color="auto" w:fill="1F497D"/>
           </w:tcPr>
           <w:p>
-            <w:r/>
+            <w:pPr>
+              <w:spacing w:after="40"/>
+            </w:pPr>
             <w:r>
               <w:rPr>
                 <w:b/>
+                <w:color w:val="FFFFFF"/>
+                <w:sz w:val="20"/>
+              </w:rPr>
+            </w:r>
+            <w:r>
+              <w:rPr>
+                <w:b/>
+                <w:color w:val="FFFFFF"/>
                 <w:sz w:val="20"/>
               </w:rPr>
               <w:t>Classe B</w:t>
@@ -3632,12 +3966,23 @@
         <w:tc>
           <w:tcPr>
             <w:tcW w:type="dxa" w:w="4986"/>
+            <w:shd w:val="clear" w:color="auto" w:fill="1F497D"/>
           </w:tcPr>
           <w:p>
-            <w:r/>
+            <w:pPr>
+              <w:spacing w:after="40"/>
+            </w:pPr>
             <w:r>
               <w:rPr>
                 <w:b/>
+                <w:color w:val="FFFFFF"/>
+                <w:sz w:val="20"/>
+              </w:rPr>
+            </w:r>
+            <w:r>
+              <w:rPr>
+                <w:b/>
+                <w:color w:val="FFFFFF"/>
                 <w:sz w:val="20"/>
               </w:rPr>
               <w:t>Termo</w:t>
@@ -3647,12 +3992,23 @@
         <w:tc>
           <w:tcPr>
             <w:tcW w:type="dxa" w:w="4986"/>
+            <w:shd w:val="clear" w:color="auto" w:fill="1F497D"/>
           </w:tcPr>
           <w:p>
-            <w:r/>
+            <w:pPr>
+              <w:spacing w:after="40"/>
+            </w:pPr>
             <w:r>
               <w:rPr>
                 <w:b/>
+                <w:color w:val="FFFFFF"/>
+                <w:sz w:val="20"/>
+              </w:rPr>
+            </w:r>
+            <w:r>
+              <w:rPr>
+                <w:b/>
+                <w:color w:val="FFFFFF"/>
                 <w:sz w:val="20"/>
               </w:rPr>
               <w:t>Significado</w:t>

</xml_diff>

<commit_message>
Corrige cardinalidade Estante-Livro e amplia Apostila da Aula 6
Estante 0..1 —— 0..* Livro: o 0..1 do lado da Estante é o que mostra que o livro existe fora de qualquer estante (agregação). Apostila ganha as seções 1.7 e 1.8 (das palavras do texto à cardinalidade; passo a passo com exemplo resolvido).
</commit_message>
<xml_diff>
--- a/Aula 06 - 25-09-2026/Aula 6 - Apostila do Aluno.docx
+++ b/Aula 06 - 25-09-2026/Aula 6 - Apostila do Aluno.docx
@@ -884,6 +884,360 @@
     </w:p>
     <w:p>
       <w:pPr>
+        <w:pStyle w:val="Heading2"/>
+      </w:pPr>
+      <w:r>
+        <w:t xml:space="preserve">1.7 Das palavras do texto à cardinalidade</w:t>
+      </w:r>
+    </w:p>
+    <w:p>
+      <w:r>
+        <w:t xml:space="preserve">Na prática, a cardinalidade quase nunca aparece pronta no enunciado: ela está escondida nas palavras que o cliente usa para descrever o negócio. Aprender a “traduzir” essas palavras é o que permite resolver as atividades de hoje sem chutar. A tabela abaixo reúne as expressões mais comuns e o que cada uma costuma significar no diagrama.</w:t>
+      </w:r>
+    </w:p>
+    <w:tbl>
+      <w:tblPr>
+        <w:tblStyle w:val="TableGrid"/>
+        <w:tblW w:type="auto" w:w="0"/>
+        <w:tblLook w:firstColumn="1" w:firstRow="1" w:lastColumn="0" w:lastRow="0" w:noHBand="0" w:noVBand="1" w:val="04A0"/>
+      </w:tblPr>
+      <w:tblGrid>
+        <w:gridCol w:w="3324"/>
+        <w:gridCol w:w="3324"/>
+        <w:gridCol w:w="3324"/>
+      </w:tblGrid>
+      <w:tr>
+        <w:tc>
+          <w:tcPr>
+            <w:tcW w:type="dxa" w:w="3324"/>
+            <w:shd w:val="clear" w:color="auto" w:fill="1F497D"/>
+          </w:tcPr>
+          <w:p>
+            <w:pPr>
+              <w:spacing w:after="40"/>
+            </w:pPr>
+            <w:r>
+              <w:rPr>
+                <w:b/>
+                <w:color w:val="FFFFFF"/>
+                <w:sz w:val="20"/>
+              </w:rPr>
+              <w:t>Expressão no texto</w:t>
+            </w:r>
+          </w:p>
+        </w:tc>
+        <w:tc>
+          <w:tcPr>
+            <w:tcW w:type="dxa" w:w="3324"/>
+            <w:shd w:val="clear" w:color="auto" w:fill="1F497D"/>
+          </w:tcPr>
+          <w:p>
+            <w:pPr>
+              <w:spacing w:after="40"/>
+            </w:pPr>
+            <w:r>
+              <w:rPr>
+                <w:b/>
+                <w:color w:val="FFFFFF"/>
+                <w:sz w:val="20"/>
+              </w:rPr>
+              <w:t>Cardinalidade</w:t>
+            </w:r>
+          </w:p>
+        </w:tc>
+        <w:tc>
+          <w:tcPr>
+            <w:tcW w:type="dxa" w:w="3324"/>
+            <w:shd w:val="clear" w:color="auto" w:fill="1F497D"/>
+          </w:tcPr>
+          <w:p>
+            <w:pPr>
+              <w:spacing w:after="40"/>
+            </w:pPr>
+            <w:r>
+              <w:rPr>
+                <w:b/>
+                <w:color w:val="FFFFFF"/>
+                <w:sz w:val="20"/>
+              </w:rPr>
+              <w:t>Exemplo</w:t>
+            </w:r>
+          </w:p>
+        </w:tc>
+      </w:tr>
+      <w:tr>
+        <w:tc>
+          <w:tcPr>
+            <w:tcW w:type="dxa" w:w="3324"/>
+          </w:tcPr>
+          <w:p>
+            <w:r>
+              <w:rPr>
+                <w:sz w:val="20"/>
+              </w:rPr>
+              <w:t>“cada ... pertence a um”, “é de um único”</w:t>
+            </w:r>
+          </w:p>
+        </w:tc>
+        <w:tc>
+          <w:tcPr>
+            <w:tcW w:type="dxa" w:w="3324"/>
+          </w:tcPr>
+          <w:p>
+            <w:r>
+              <w:rPr>
+                <w:sz w:val="20"/>
+              </w:rPr>
+              <w:t>1</w:t>
+            </w:r>
+          </w:p>
+        </w:tc>
+        <w:tc>
+          <w:tcPr>
+            <w:tcW w:type="dxa" w:w="3324"/>
+          </w:tcPr>
+          <w:p>
+            <w:r>
+              <w:rPr>
+                <w:sz w:val="20"/>
+              </w:rPr>
+              <w:t>Cada Pedido pertence a um Cliente → 1 do lado do Cliente</w:t>
+            </w:r>
+          </w:p>
+        </w:tc>
+      </w:tr>
+      <w:tr>
+        <w:tc>
+          <w:tcPr>
+            <w:tcW w:type="dxa" w:w="3324"/>
+          </w:tcPr>
+          <w:p>
+            <w:r>
+              <w:rPr>
+                <w:sz w:val="20"/>
+              </w:rPr>
+              <w:t>“pode ter um”, “às vezes tem”, “opcional”</w:t>
+            </w:r>
+          </w:p>
+        </w:tc>
+        <w:tc>
+          <w:tcPr>
+            <w:tcW w:type="dxa" w:w="3324"/>
+          </w:tcPr>
+          <w:p>
+            <w:r>
+              <w:rPr>
+                <w:sz w:val="20"/>
+              </w:rPr>
+              <w:t>0..1</w:t>
+            </w:r>
+          </w:p>
+        </w:tc>
+        <w:tc>
+          <w:tcPr>
+            <w:tcW w:type="dxa" w:w="3324"/>
+          </w:tcPr>
+          <w:p>
+            <w:r>
+              <w:rPr>
+                <w:sz w:val="20"/>
+              </w:rPr>
+              <w:t>O pedido pode ter uma entrega → 0..1 do lado da Entrega</w:t>
+            </w:r>
+          </w:p>
+        </w:tc>
+      </w:tr>
+      <w:tr>
+        <w:tc>
+          <w:tcPr>
+            <w:tcW w:type="dxa" w:w="3324"/>
+          </w:tcPr>
+          <w:p>
+            <w:r>
+              <w:rPr>
+                <w:sz w:val="20"/>
+              </w:rPr>
+              <w:t>“pode ter vários”, “nenhum ou muitos”</w:t>
+            </w:r>
+          </w:p>
+        </w:tc>
+        <w:tc>
+          <w:tcPr>
+            <w:tcW w:type="dxa" w:w="3324"/>
+          </w:tcPr>
+          <w:p>
+            <w:r>
+              <w:rPr>
+                <w:sz w:val="20"/>
+              </w:rPr>
+              <w:t>0..* (ou *)</w:t>
+            </w:r>
+          </w:p>
+        </w:tc>
+        <w:tc>
+          <w:tcPr>
+            <w:tcW w:type="dxa" w:w="3324"/>
+          </w:tcPr>
+          <w:p>
+            <w:r>
+              <w:rPr>
+                <w:sz w:val="20"/>
+              </w:rPr>
+              <w:t>Um cliente pode fazer vários pedidos → * do lado do Pedido</w:t>
+            </w:r>
+          </w:p>
+        </w:tc>
+      </w:tr>
+      <w:tr>
+        <w:tc>
+          <w:tcPr>
+            <w:tcW w:type="dxa" w:w="3324"/>
+          </w:tcPr>
+          <w:p>
+            <w:r>
+              <w:rPr>
+                <w:sz w:val="20"/>
+              </w:rPr>
+              <w:t>“pelo menos um”, “um ou mais”, “obrigatório ter”</w:t>
+            </w:r>
+          </w:p>
+        </w:tc>
+        <w:tc>
+          <w:tcPr>
+            <w:tcW w:type="dxa" w:w="3324"/>
+          </w:tcPr>
+          <w:p>
+            <w:r>
+              <w:rPr>
+                <w:sz w:val="20"/>
+              </w:rPr>
+              <w:t>1..*</w:t>
+            </w:r>
+          </w:p>
+        </w:tc>
+        <w:tc>
+          <w:tcPr>
+            <w:tcW w:type="dxa" w:w="3324"/>
+          </w:tcPr>
+          <w:p>
+            <w:r>
+              <w:rPr>
+                <w:sz w:val="20"/>
+              </w:rPr>
+              <w:t>Toda turma tem pelo menos um aluno → 1..* do lado do Aluno</w:t>
+            </w:r>
+          </w:p>
+        </w:tc>
+      </w:tr>
+      <w:tr>
+        <w:tc>
+          <w:tcPr>
+            <w:tcW w:type="dxa" w:w="3324"/>
+          </w:tcPr>
+          <w:p>
+            <w:r>
+              <w:rPr>
+                <w:sz w:val="20"/>
+              </w:rPr>
+              <w:t>“no máximo N”, “até N”</w:t>
+            </w:r>
+          </w:p>
+        </w:tc>
+        <w:tc>
+          <w:tcPr>
+            <w:tcW w:type="dxa" w:w="3324"/>
+          </w:tcPr>
+          <w:p>
+            <w:r>
+              <w:rPr>
+                <w:sz w:val="20"/>
+              </w:rPr>
+              <w:t>0..N</w:t>
+            </w:r>
+          </w:p>
+        </w:tc>
+        <w:tc>
+          <w:tcPr>
+            <w:tcW w:type="dxa" w:w="3324"/>
+          </w:tcPr>
+          <w:p>
+            <w:r>
+              <w:rPr>
+                <w:sz w:val="20"/>
+              </w:rPr>
+              <w:t>Até 3 livros emprestados → 0..3 do lado do Emprestimo</w:t>
+            </w:r>
+          </w:p>
+        </w:tc>
+      </w:tr>
+    </w:tbl>
+    <w:p/>
+    <w:p>
+      <w:r>
+        <w:t xml:space="preserve">Cuidado com a palavra “vários”: ela quase sempre indica o máximo (muitos), mas não diz nada sobre o mínimo. Antes de escrever “1..*”, procurem no texto se a relação é realmente obrigatória; se não houver nenhuma regra dizendo isso, o mais seguro é “0..*”.</w:t>
+      </w:r>
+    </w:p>
+    <w:p>
+      <w:pPr>
+        <w:pStyle w:val="Heading2"/>
+      </w:pPr>
+      <w:r>
+        <w:t xml:space="preserve">1.8 Passo a passo para descobrir a cardinalidade</w:t>
+      </w:r>
+    </w:p>
+    <w:p>
+      <w:r>
+        <w:t xml:space="preserve">Para cada relacionamento do diagrama, façam sempre as mesmas quatro perguntas, uma ponta de cada vez:</w:t>
+      </w:r>
+    </w:p>
+    <w:p>
+      <w:r>
+        <w:t xml:space="preserve">1.  Escolham uma ponta e leiam a frase-modelo: “um objeto da classe A se relaciona com quantos objetos da classe B?” A resposta é escrita perto de B.</w:t>
+      </w:r>
+    </w:p>
+    <w:p>
+      <w:r>
+        <w:t xml:space="preserve">2.  Qual o MÍNIMO? Pode ser zero (a relação é opcional ou pode ainda não existir) ou precisa ser pelo menos um (a relação é obrigatória desde a criação do objeto)?</w:t>
+      </w:r>
+    </w:p>
+    <w:p>
+      <w:r>
+        <w:t xml:space="preserve">3.  Qual o MÁXIMO? Só um, um número concreto vindo de uma regra de negócio, ou sem limite (*)?</w:t>
+      </w:r>
+    </w:p>
+    <w:p>
+      <w:r>
+        <w:t xml:space="preserve">4.  Repitam as perguntas 1 a 3 no sentido contrário (de B para A) e escrevam a resposta perto de A. Por fim, confiram se alguma regra de negócio do cenário justifica cada número.</w:t>
+      </w:r>
+    </w:p>
+    <w:p>
+      <w:r>
+        <w:t xml:space="preserve">Exemplo resolvido (cinema “Tela Azul”): “Cada sessão acontece em uma sala. Uma sala recebe várias sessões por dia, mas pode ficar fechada para manutenção. Cada ingresso é de uma única sessão, e uma sessão pode vender até 120 ingressos, que é a capacidade da sala.”</w:t>
+      </w:r>
+    </w:p>
+    <w:p>
+      <w:pPr>
+        <w:pStyle w:val="ListBullet"/>
+      </w:pPr>
+      <w:r>
+        <w:t xml:space="preserve">Sala —— Sessao: uma Sessao acontece em quantas Salas? Exatamente 1 (“cada sessão acontece em uma sala”). Uma Sala recebe quantas Sessoes? De zero (fechada para manutenção) a muitas (“várias”). Resultado: Sala 1 —— 0..* Sessao.</w:t>
+      </w:r>
+    </w:p>
+    <w:p>
+      <w:pPr>
+        <w:pStyle w:val="ListBullet"/>
+      </w:pPr>
+      <w:r>
+        <w:t xml:space="preserve">Sessao —— Ingresso: um Ingresso é de quantas Sessoes? Exatamente 1 (“de uma única sessão”). Uma Sessao vende quantos Ingressos? De zero (ninguém comprou ainda) até 120 (regra da capacidade). Resultado: Sessao 1 —— 0..120 Ingresso.</w:t>
+      </w:r>
+    </w:p>
+    <w:p>
+      <w:r>
+        <w:t xml:space="preserve">Reparem que o número 120 não foi inventado: ele saiu de uma regra do texto, exatamente como o “0..3” da Biblioteca. E reparem também que nenhum mínimo foi “1..*” — nada no texto obriga uma sala a ter sessão ou uma sessão a ter ingresso vendido.</w:t>
+      </w:r>
+    </w:p>
+    <w:p>
+      <w:pPr>
         <w:pStyle w:val="Heading1"/>
       </w:pPr>
       <w:r>
@@ -1012,7 +1366,7 @@
         <w:pStyle w:val="ListBullet"/>
       </w:pPr>
       <w:r>
-        <w:t>Agregação: todo-parte fraca; a parte pode existir sem o todo, então o lado do todo costuma aceitar 0. Ex.: Estante 1 —— 0..* Livro.</w:t>
+        <w:t>Agregação: todo-parte fraca; a parte pode existir sem o todo, então o lado do todo costuma aceitar 0. Ex.: Estante 0..1 —— 0..* Livro.</w:t>
       </w:r>
     </w:p>
     <w:p>
@@ -1137,7 +1491,7 @@
         <w:pStyle w:val="ListBullet"/>
       </w:pPr>
       <w:r>
-        <w:t>Estante 1 —— 0..* Livro (agregação)</w:t>
+        <w:t>Estante 0..1 —— 0..* Livro (agregação)</w:t>
       </w:r>
     </w:p>
     <w:p>
@@ -2196,12 +2550,11 @@
             <w:tcW w:type="dxa" w:w="1994"/>
           </w:tcPr>
           <w:p>
-            <w:r/>
             <w:r>
               <w:rPr>
                 <w:sz w:val="20"/>
               </w:rPr>
-              <w:t>1</w:t>
+              <w:t>0..1</w:t>
             </w:r>
           </w:p>
         </w:tc>
@@ -2358,7 +2711,7 @@
     </w:p>
     <w:p>
       <w:r>
-        <w:t>Estante 1 —— 0..* Livro. Do lado da Estante, “1”: cada Livro (quando está guardado) pertence a exatamente uma Estante. Do lado do Livro, “0..*”: uma Estante pode reunir zero ou muitos Livros (pode até estar vazia). É agregação (losango vazado): mesmo sem estante nenhuma, o Livro continua existindo, e a cardinalidade “0..*” do lado do Livro é compatível com essa independência. Compare com a composição Pedido-ItemPedido, onde o lado do todo é sempre “1”, nunca “0..1”.</w:t>
+        <w:t>Estante 0..1 —— 0..* Livro. Do lado da Estante, “0..1”: cada Livro está em no máximo uma Estante — e pode não estar em nenhuma (emprestado, em restauração ou recém-chegado à biblioteca). Do lado do Livro, “0..*”: uma Estante pode reunir zero ou muitos Livros (pode até estar vazia). É agregação (losango vazado): mesmo sem estante nenhuma, o Livro continua existindo — e é justamente o “0” do lado da Estante que registra essa independência no diagrama. Compare com a composição Pedido-ItemPedido, onde o lado do todo é sempre “1”, nunca “0..1”: um ItemPedido não existe fora de um Pedido.</w:t>
       </w:r>
     </w:p>
     <w:p>
@@ -2440,7 +2793,7 @@
     </w:p>
     <w:p>
       <w:r>
-        <w:t>3.  Estante 1 —— ___ Livro</w:t>
+        <w:t>3.  Estante 0..1 —— ___ Livro</w:t>
       </w:r>
     </w:p>
     <w:p>
@@ -3920,7 +4273,7 @@
     </w:p>
     <w:p>
       <w:r>
-        <w:t>3.  Estante 1 —— 1 Livro</w:t>
+        <w:t>3.  Estante 0..1 —— 1 Livro</w:t>
       </w:r>
     </w:p>
     <w:p>
@@ -4273,7 +4626,7 @@
     </w:p>
     <w:p>
       <w:r>
-        <w:t>8.  Na Biblioteca, por que “Estante 1 —— 0..* Livro” é agregação, e o que a cardinalidade tem a ver com isso?</w:t>
+        <w:t>8.  Na Biblioteca, por que “Estante 0..1 —— 0..* Livro” é agregação, e o que a cardinalidade tem a ver com isso?</w:t>
       </w:r>
     </w:p>
     <w:p>

</xml_diff>